<commit_message>
Updated Part 1 and conclusion draft
</commit_message>
<xml_diff>
--- a/reading_list.docx
+++ b/reading_list.docx
@@ -1,13 +1,11 @@
 
 <file path=word/document.xml><?xml version="1.0" encoding="utf-8"?>
-<w:document xmlns:o="urn:schemas-microsoft-com:office:office" xmlns:r="http://schemas.openxmlformats.org/officeDocument/2006/relationships" xmlns:v="urn:schemas-microsoft-com:vml" xmlns:w="http://schemas.openxmlformats.org/wordprocessingml/2006/main" xmlns:w10="urn:schemas-microsoft-com:office:word" xmlns:wp="http://schemas.openxmlformats.org/drawingml/2006/wordprocessingDrawing" xmlns:pic="http://schemas.openxmlformats.org/drawingml/2006/picture" xmlns:wps="http://schemas.microsoft.com/office/word/2010/wordprocessingShape" xmlns:wpg="http://schemas.microsoft.com/office/word/2010/wordprocessingGroup" xmlns:mc="http://schemas.openxmlformats.org/markup-compatibility/2006" xmlns:wp14="http://schemas.microsoft.com/office/word/2010/wordprocessingDrawing" xmlns:w14="http://schemas.microsoft.com/office/word/2010/wordml" xmlns:w15="http://schemas.microsoft.com/office/word/2012/wordml" mc:Ignorable="w14 wp14 w15">
+<w:document xmlns:wpc="http://schemas.microsoft.com/office/word/2010/wordprocessingCanvas" xmlns:cx="http://schemas.microsoft.com/office/drawing/2014/chartex" xmlns:cx1="http://schemas.microsoft.com/office/drawing/2015/9/8/chartex" xmlns:cx2="http://schemas.microsoft.com/office/drawing/2015/10/21/chartex" xmlns:cx3="http://schemas.microsoft.com/office/drawing/2016/5/9/chartex" xmlns:cx4="http://schemas.microsoft.com/office/drawing/2016/5/10/chartex" xmlns:cx5="http://schemas.microsoft.com/office/drawing/2016/5/11/chartex" xmlns:cx6="http://schemas.microsoft.com/office/drawing/2016/5/12/chartex" xmlns:cx7="http://schemas.microsoft.com/office/drawing/2016/5/13/chartex" xmlns:cx8="http://schemas.microsoft.com/office/drawing/2016/5/14/chartex" xmlns:mc="http://schemas.openxmlformats.org/markup-compatibility/2006" xmlns:aink="http://schemas.microsoft.com/office/drawing/2016/ink" xmlns:am3d="http://schemas.microsoft.com/office/drawing/2017/model3d" xmlns:o="urn:schemas-microsoft-com:office:office" xmlns:oel="http://schemas.microsoft.com/office/2019/extlst" xmlns:r="http://schemas.openxmlformats.org/officeDocument/2006/relationships" xmlns:m="http://schemas.openxmlformats.org/officeDocument/2006/math" xmlns:v="urn:schemas-microsoft-com:vml" xmlns:wp14="http://schemas.microsoft.com/office/word/2010/wordprocessingDrawing" xmlns:wp="http://schemas.openxmlformats.org/drawingml/2006/wordprocessingDrawing" xmlns:w10="urn:schemas-microsoft-com:office:word" xmlns:w="http://schemas.openxmlformats.org/wordprocessingml/2006/main" xmlns:w14="http://schemas.microsoft.com/office/word/2010/wordml" xmlns:w15="http://schemas.microsoft.com/office/word/2012/wordml" xmlns:w16cex="http://schemas.microsoft.com/office/word/2018/wordml/cex" xmlns:w16cid="http://schemas.microsoft.com/office/word/2016/wordml/cid" xmlns:w16="http://schemas.microsoft.com/office/word/2018/wordml" xmlns:w16du="http://schemas.microsoft.com/office/word/2023/wordml/word16du" xmlns:w16sdtdh="http://schemas.microsoft.com/office/word/2020/wordml/sdtdatahash" xmlns:w16sdtfl="http://schemas.microsoft.com/office/word/2024/wordml/sdtformatlock" xmlns:w16se="http://schemas.microsoft.com/office/word/2015/wordml/symex" xmlns:wpg="http://schemas.microsoft.com/office/word/2010/wordprocessingGroup" xmlns:wpi="http://schemas.microsoft.com/office/word/2010/wordprocessingInk" xmlns:wne="http://schemas.microsoft.com/office/word/2006/wordml" xmlns:wps="http://schemas.microsoft.com/office/word/2010/wordprocessingShape" mc:Ignorable="w14 w15 w16se w16cid w16 w16cex w16sdtdh w16sdtfl w16du wp14">
   <w:body>
     <w:p>
       <w:pPr>
-        <w:pStyle w:val="BodyText"/>
-        <w:bidi w:val="0"/>
-        <w:spacing w:before="0" w:after="0"/>
-        <w:jc w:val="start"/>
+        <w:pStyle w:val="Corpotesto"/>
+        <w:spacing w:after="0"/>
         <w:rPr>
           <w:b/>
           <w:bCs/>
@@ -27,311 +25,374 @@
     </w:p>
     <w:p>
       <w:pPr>
-        <w:pStyle w:val="BodyText"/>
+        <w:pStyle w:val="Corpotesto"/>
         <w:numPr>
           <w:ilvl w:val="0"/>
           <w:numId w:val="1"/>
         </w:numPr>
         <w:tabs>
-          <w:tab w:val="clear" w:pos="709"/>
-          <w:tab w:val="left" w:pos="720" w:leader="none"/>
-        </w:tabs>
-        <w:bidi w:val="0"/>
-        <w:spacing w:before="0" w:after="0"/>
-        <w:ind w:hanging="283" w:start="720"/>
-        <w:jc w:val="start"/>
-        <w:rPr/>
-      </w:pPr>
-      <w:r>
-        <w:rPr/>
+          <w:tab w:val="left" w:pos="720"/>
+        </w:tabs>
+        <w:spacing w:after="0"/>
+      </w:pPr>
+      <w:r>
         <w:t>Pearl, J., &amp; Mackenzie, D. (2018). The Book of Why: The New Science of Cause and Effect. Basic Books. ISBN 978-0-465-09760-9.</w:t>
       </w:r>
     </w:p>
     <w:p>
       <w:pPr>
-        <w:pStyle w:val="BodyText"/>
+        <w:pStyle w:val="Corpotesto"/>
         <w:numPr>
           <w:ilvl w:val="0"/>
           <w:numId w:val="1"/>
         </w:numPr>
         <w:tabs>
-          <w:tab w:val="clear" w:pos="709"/>
-          <w:tab w:val="left" w:pos="720" w:leader="none"/>
-        </w:tabs>
-        <w:bidi w:val="0"/>
-        <w:spacing w:before="0" w:after="0"/>
-        <w:ind w:hanging="283" w:start="720"/>
-        <w:jc w:val="start"/>
-        <w:rPr/>
-      </w:pPr>
-      <w:r>
-        <w:rPr/>
+          <w:tab w:val="left" w:pos="720"/>
+        </w:tabs>
+        <w:spacing w:after="0"/>
+      </w:pPr>
+      <w:r>
         <w:t xml:space="preserve">Rohrer, J. M. (2018). Thinking clearly about correlations and causation: Graphical causal models for observational data. Advances in Methods and Practices in Psychological Science, 1(1), 27–42. </w:t>
       </w:r>
-      <w:hyperlink r:id="rId2">
+      <w:hyperlink r:id="rId5">
         <w:r>
           <w:rPr>
-            <w:rStyle w:val="Hyperlink"/>
+            <w:rStyle w:val="Collegamentoipertestuale"/>
           </w:rPr>
           <w:t>https://doi.org/10.1177/2515245917745629</w:t>
         </w:r>
       </w:hyperlink>
       <w:r>
-        <w:rPr/>
         <w:t xml:space="preserve"> </w:t>
       </w:r>
     </w:p>
     <w:p>
       <w:pPr>
-        <w:pStyle w:val="BodyText"/>
+        <w:pStyle w:val="Corpotesto"/>
         <w:numPr>
           <w:ilvl w:val="0"/>
           <w:numId w:val="1"/>
         </w:numPr>
         <w:tabs>
-          <w:tab w:val="clear" w:pos="709"/>
-          <w:tab w:val="left" w:pos="720" w:leader="none"/>
-        </w:tabs>
-        <w:bidi w:val="0"/>
-        <w:spacing w:before="0" w:after="0"/>
-        <w:ind w:hanging="283" w:start="720"/>
-        <w:jc w:val="start"/>
-        <w:rPr/>
-      </w:pPr>
-      <w:r>
-        <w:rPr/>
+          <w:tab w:val="left" w:pos="720"/>
+        </w:tabs>
+        <w:spacing w:after="0"/>
+      </w:pPr>
+      <w:r>
         <w:t xml:space="preserve">Huntington-Klein, N. (2021). The Effect: An Introduction to Research Design and Causality. Chapman and Hall/CRC. Free online: </w:t>
       </w:r>
-      <w:hyperlink r:id="rId3">
+      <w:hyperlink r:id="rId6">
         <w:r>
           <w:rPr>
-            <w:rStyle w:val="Hyperlink"/>
+            <w:rStyle w:val="Collegamentoipertestuale"/>
           </w:rPr>
           <w:t>https://theeffectbook.net/</w:t>
         </w:r>
       </w:hyperlink>
       <w:r>
-        <w:rPr/>
         <w:t xml:space="preserve"> </w:t>
       </w:r>
     </w:p>
     <w:p>
       <w:pPr>
-        <w:pStyle w:val="BodyText"/>
+        <w:pStyle w:val="Corpotesto"/>
         <w:numPr>
           <w:ilvl w:val="0"/>
           <w:numId w:val="1"/>
         </w:numPr>
         <w:tabs>
-          <w:tab w:val="clear" w:pos="709"/>
-          <w:tab w:val="left" w:pos="720" w:leader="none"/>
-        </w:tabs>
-        <w:bidi w:val="0"/>
-        <w:spacing w:before="0" w:after="0"/>
-        <w:ind w:hanging="283" w:start="720"/>
-        <w:jc w:val="start"/>
-        <w:rPr/>
-      </w:pPr>
-      <w:r>
-        <w:rPr/>
-        <w:t>Pearl, J., Glymour, M., &amp; Jewell, N. P. (2016). Causal Inference in Statistics: A Primer. Wiley. ISBN 978-1-119-18684-7.</w:t>
+          <w:tab w:val="left" w:pos="720"/>
+        </w:tabs>
+        <w:spacing w:after="0"/>
+      </w:pPr>
+      <w:r>
+        <w:t xml:space="preserve">Pearl, J., </w:t>
+      </w:r>
+      <w:proofErr w:type="spellStart"/>
+      <w:r>
+        <w:t>Glymour</w:t>
+      </w:r>
+      <w:proofErr w:type="spellEnd"/>
+      <w:r>
+        <w:t>, M., &amp; Jewell, N. P. (2016). Causal Inference in Statistics: A Primer. Wiley. ISBN 978-1-119-18684-7.</w:t>
       </w:r>
     </w:p>
     <w:p>
       <w:pPr>
-        <w:pStyle w:val="BodyText"/>
+        <w:pStyle w:val="Corpotesto"/>
         <w:numPr>
           <w:ilvl w:val="0"/>
           <w:numId w:val="1"/>
         </w:numPr>
         <w:tabs>
-          <w:tab w:val="clear" w:pos="709"/>
-          <w:tab w:val="left" w:pos="720" w:leader="none"/>
-        </w:tabs>
-        <w:bidi w:val="0"/>
-        <w:spacing w:before="0" w:after="0"/>
-        <w:ind w:hanging="283" w:start="720"/>
-        <w:jc w:val="start"/>
-        <w:rPr/>
-      </w:pPr>
-      <w:r>
-        <w:rPr/>
+          <w:tab w:val="left" w:pos="720"/>
+        </w:tabs>
+        <w:spacing w:after="0"/>
+      </w:pPr>
+      <w:r>
         <w:t xml:space="preserve">Cinelli, C., Forney, A., &amp; Pearl, J. (2024). A crash course in good and bad controls. Sociological Methods &amp; Research, 53(3), 1071–1104. </w:t>
       </w:r>
-      <w:hyperlink r:id="rId4">
+      <w:hyperlink r:id="rId7">
         <w:r>
           <w:rPr>
-            <w:rStyle w:val="Hyperlink"/>
+            <w:rStyle w:val="Collegamentoipertestuale"/>
           </w:rPr>
           <w:t>https://doi.org/10.1177/00491241221099552</w:t>
         </w:r>
       </w:hyperlink>
       <w:r>
-        <w:rPr/>
         <w:t xml:space="preserve"> </w:t>
       </w:r>
     </w:p>
     <w:p>
       <w:pPr>
-        <w:pStyle w:val="BodyText"/>
+        <w:pStyle w:val="Corpotesto"/>
         <w:numPr>
           <w:ilvl w:val="0"/>
           <w:numId w:val="1"/>
         </w:numPr>
         <w:tabs>
-          <w:tab w:val="clear" w:pos="709"/>
-          <w:tab w:val="left" w:pos="720" w:leader="none"/>
-        </w:tabs>
-        <w:bidi w:val="0"/>
-        <w:spacing w:before="0" w:after="0"/>
-        <w:ind w:hanging="283" w:start="720"/>
-        <w:jc w:val="start"/>
-        <w:rPr/>
-      </w:pPr>
-      <w:r>
-        <w:rPr/>
-        <w:t xml:space="preserve">Textor, J., van der Zander, B., Gilthorpe, M. S., Liśkiewicz, M., &amp; Ellison, G. T. H. (2016). Robust causal inference using directed acyclic graphs: The R package 'dagitty'. International Journal of Epidemiology, 45(6), 1887–1894. </w:t>
-      </w:r>
-      <w:hyperlink r:id="rId5">
+          <w:tab w:val="left" w:pos="720"/>
+        </w:tabs>
+        <w:spacing w:after="0"/>
+      </w:pPr>
+      <w:r>
+        <w:t xml:space="preserve">Textor, J., van der Zander, B., </w:t>
+      </w:r>
+      <w:proofErr w:type="spellStart"/>
+      <w:r>
+        <w:t>Gilthorpe</w:t>
+      </w:r>
+      <w:proofErr w:type="spellEnd"/>
+      <w:r>
+        <w:t xml:space="preserve">, M. S., </w:t>
+      </w:r>
+      <w:proofErr w:type="spellStart"/>
+      <w:r>
+        <w:t>Liśkiewicz</w:t>
+      </w:r>
+      <w:proofErr w:type="spellEnd"/>
+      <w:r>
+        <w:t>, M., &amp; Ellison, G. T. H. (2016). Robust causal inference using directed acyclic graphs: The R package '</w:t>
+      </w:r>
+      <w:proofErr w:type="spellStart"/>
+      <w:r>
+        <w:t>dagitty</w:t>
+      </w:r>
+      <w:proofErr w:type="spellEnd"/>
+      <w:r>
+        <w:t xml:space="preserve">'. International Journal of Epidemiology, 45(6), 1887–1894. </w:t>
+      </w:r>
+      <w:hyperlink r:id="rId8">
         <w:r>
           <w:rPr>
-            <w:rStyle w:val="Hyperlink"/>
+            <w:rStyle w:val="Collegamentoipertestuale"/>
           </w:rPr>
           <w:t>https://doi.org/10.1093/ije/dyw341</w:t>
         </w:r>
       </w:hyperlink>
       <w:r>
-        <w:rPr/>
         <w:t xml:space="preserve"> </w:t>
       </w:r>
     </w:p>
     <w:p>
       <w:pPr>
-        <w:pStyle w:val="BodyText"/>
+        <w:pStyle w:val="Corpotesto"/>
         <w:numPr>
           <w:ilvl w:val="0"/>
           <w:numId w:val="1"/>
         </w:numPr>
         <w:tabs>
-          <w:tab w:val="clear" w:pos="709"/>
-          <w:tab w:val="left" w:pos="720" w:leader="none"/>
-        </w:tabs>
-        <w:bidi w:val="0"/>
-        <w:spacing w:before="0" w:after="0"/>
-        <w:ind w:hanging="283" w:start="720"/>
-        <w:jc w:val="start"/>
-        <w:rPr/>
-      </w:pPr>
-      <w:r>
-        <w:rPr/>
+          <w:tab w:val="left" w:pos="720"/>
+        </w:tabs>
+        <w:spacing w:after="0"/>
+      </w:pPr>
+      <w:r>
         <w:t xml:space="preserve">Siebert, J. (2023). Applications of statistical causal inference in software engineering. Information and Software Technology, 159, 107198. </w:t>
       </w:r>
-      <w:hyperlink r:id="rId6">
+      <w:hyperlink r:id="rId9">
         <w:r>
           <w:rPr>
-            <w:rStyle w:val="Hyperlink"/>
+            <w:rStyle w:val="Collegamentoipertestuale"/>
           </w:rPr>
           <w:t>https://doi.org/10.1016/j.infsof.2023.107198</w:t>
         </w:r>
       </w:hyperlink>
       <w:r>
-        <w:rPr/>
         <w:t xml:space="preserve"> </w:t>
       </w:r>
     </w:p>
     <w:p>
       <w:pPr>
-        <w:pStyle w:val="BodyText"/>
+        <w:pStyle w:val="Corpotesto"/>
         <w:numPr>
           <w:ilvl w:val="0"/>
           <w:numId w:val="1"/>
         </w:numPr>
         <w:tabs>
-          <w:tab w:val="clear" w:pos="709"/>
-          <w:tab w:val="left" w:pos="720" w:leader="none"/>
-        </w:tabs>
-        <w:bidi w:val="0"/>
-        <w:spacing w:before="0" w:after="0"/>
-        <w:ind w:hanging="283" w:start="720"/>
-        <w:jc w:val="start"/>
-        <w:rPr/>
-      </w:pPr>
-      <w:r>
-        <w:rPr/>
+          <w:tab w:val="left" w:pos="720"/>
+        </w:tabs>
+        <w:spacing w:after="0"/>
+      </w:pPr>
+      <w:r>
         <w:t xml:space="preserve">McElreath, R. (2020). Statistical Rethinking: A Bayesian Course with Examples in R and Stan (2nd ed.). Chapman and Hall/CRC. </w:t>
       </w:r>
-      <w:hyperlink r:id="rId7">
+      <w:hyperlink r:id="rId10">
         <w:r>
           <w:rPr>
-            <w:rStyle w:val="Hyperlink"/>
+            <w:rStyle w:val="Collegamentoipertestuale"/>
           </w:rPr>
           <w:t>https://doi.org/10.1201/9780429029608</w:t>
         </w:r>
       </w:hyperlink>
       <w:r>
-        <w:rPr/>
         <w:t xml:space="preserve"> </w:t>
       </w:r>
     </w:p>
     <w:p>
       <w:pPr>
-        <w:pStyle w:val="BodyText"/>
+        <w:pStyle w:val="Corpotesto"/>
         <w:numPr>
           <w:ilvl w:val="0"/>
           <w:numId w:val="1"/>
         </w:numPr>
         <w:tabs>
-          <w:tab w:val="clear" w:pos="709"/>
-          <w:tab w:val="left" w:pos="720" w:leader="none"/>
-        </w:tabs>
-        <w:bidi w:val="0"/>
-        <w:spacing w:before="0" w:after="0"/>
-        <w:ind w:hanging="283" w:start="720"/>
-        <w:jc w:val="start"/>
-        <w:rPr/>
-      </w:pPr>
-      <w:r>
-        <w:rPr/>
-        <w:t xml:space="preserve">Frattini, J., Torkar, R., Feldt, R., &amp; Furia, C. A. (2026). Towards improving the external validity of software engineering experiments with transportability methods. arXiv. </w:t>
-      </w:r>
-      <w:hyperlink r:id="rId8">
+          <w:tab w:val="left" w:pos="720"/>
+        </w:tabs>
+        <w:spacing w:after="0"/>
+      </w:pPr>
+      <w:r>
+        <w:t xml:space="preserve">Frattini, J., Torkar, R., Feldt, R., &amp; Furia, C. A. (2026). Towards improving the external validity of software engineering experiments with transportability methods. </w:t>
+      </w:r>
+      <w:proofErr w:type="spellStart"/>
+      <w:r>
+        <w:t>arXiv</w:t>
+      </w:r>
+      <w:proofErr w:type="spellEnd"/>
+      <w:r>
+        <w:t xml:space="preserve">. </w:t>
+      </w:r>
+      <w:hyperlink r:id="rId11">
         <w:r>
           <w:rPr>
-            <w:rStyle w:val="Hyperlink"/>
+            <w:rStyle w:val="Collegamentoipertestuale"/>
           </w:rPr>
           <w:t>https://doi.org/10.48550/arXiv.2604.08200</w:t>
         </w:r>
       </w:hyperlink>
       <w:r>
-        <w:rPr/>
+        <w:t xml:space="preserve"> </w:t>
+      </w:r>
+    </w:p>
+    <w:p>
+      <w:pPr>
+        <w:pStyle w:val="Corpotesto"/>
+        <w:numPr>
+          <w:ilvl w:val="0"/>
+          <w:numId w:val="1"/>
+        </w:numPr>
+        <w:tabs>
+          <w:tab w:val="left" w:pos="720"/>
+        </w:tabs>
+      </w:pPr>
+      <w:r>
+        <w:t>Giamattei,</w:t>
+      </w:r>
+      <w:r>
+        <w:t xml:space="preserve"> L.,</w:t>
+      </w:r>
+      <w:r>
+        <w:t xml:space="preserve"> Guerriero,</w:t>
+      </w:r>
+      <w:r>
+        <w:t xml:space="preserve"> A., </w:t>
+      </w:r>
+      <w:r>
+        <w:t>Pietrantuono,</w:t>
+      </w:r>
+      <w:r>
+        <w:t xml:space="preserve"> R.,</w:t>
+      </w:r>
+      <w:r>
+        <w:t xml:space="preserve"> Russo,</w:t>
+      </w:r>
+      <w:r>
+        <w:t xml:space="preserve"> S (2025). </w:t>
+      </w:r>
+      <w:r>
+        <w:t>Causal reasoning in Software Quality Assurance: A systematic review,</w:t>
+      </w:r>
+      <w:r>
+        <w:t xml:space="preserve"> </w:t>
+      </w:r>
+      <w:r>
+        <w:t>Information and Software</w:t>
+      </w:r>
+      <w:r>
+        <w:t xml:space="preserve"> </w:t>
+      </w:r>
+      <w:r>
+        <w:t>Technology,</w:t>
+      </w:r>
+      <w:r>
+        <w:t xml:space="preserve"> </w:t>
+      </w:r>
+      <w:r>
+        <w:t>Volume 178,</w:t>
+      </w:r>
+      <w:r>
+        <w:t xml:space="preserve"> </w:t>
+      </w:r>
+      <w:r>
+        <w:t>2025,</w:t>
+      </w:r>
+      <w:r>
+        <w:t xml:space="preserve"> </w:t>
+      </w:r>
+      <w:r>
+        <w:t>107599,</w:t>
+      </w:r>
+      <w:r>
+        <w:br/>
+      </w:r>
+      <w:hyperlink r:id="rId12" w:history="1">
+        <w:r>
+          <w:rPr>
+            <w:rStyle w:val="Collegamentoipertestuale"/>
+          </w:rPr>
+          <w:t>https://doi.org/10.1016/j.infsof.2024.107599</w:t>
+        </w:r>
+      </w:hyperlink>
+      <w:r>
         <w:t xml:space="preserve"> </w:t>
       </w:r>
     </w:p>
     <w:sectPr>
-      <w:type w:val="nextPage"/>
       <w:pgSz w:w="11906" w:h="16838"/>
-      <w:pgMar w:left="1134" w:right="1134" w:gutter="0" w:header="0" w:top="1134" w:footer="0" w:bottom="1134"/>
-      <w:pgNumType w:fmt="decimal"/>
-      <w:formProt w:val="false"/>
-      <w:textDirection w:val="lrTb"/>
+      <w:pgMar w:top="1134" w:right="1134" w:bottom="1134" w:left="1134" w:header="0" w:footer="0" w:gutter="0"/>
+      <w:cols w:space="720"/>
+      <w:formProt w:val="0"/>
     </w:sectPr>
   </w:body>
 </w:document>
 </file>
 
 <file path=word/numbering.xml><?xml version="1.0" encoding="utf-8"?>
-<w:numbering xmlns:w="http://schemas.openxmlformats.org/wordprocessingml/2006/main" xmlns:o="urn:schemas-microsoft-com:office:office" xmlns:r="http://schemas.openxmlformats.org/officeDocument/2006/relationships" xmlns:v="urn:schemas-microsoft-com:vml" xmlns:mc="http://schemas.openxmlformats.org/markup-compatibility/2006" xmlns:w14="http://schemas.microsoft.com/office/word/2010/wordml" mc:Ignorable="w14">
-  <w:abstractNum w:abstractNumId="1">
+<w:numbering xmlns:wpc="http://schemas.microsoft.com/office/word/2010/wordprocessingCanvas" xmlns:cx="http://schemas.microsoft.com/office/drawing/2014/chartex" xmlns:cx1="http://schemas.microsoft.com/office/drawing/2015/9/8/chartex" xmlns:cx2="http://schemas.microsoft.com/office/drawing/2015/10/21/chartex" xmlns:cx3="http://schemas.microsoft.com/office/drawing/2016/5/9/chartex" xmlns:cx4="http://schemas.microsoft.com/office/drawing/2016/5/10/chartex" xmlns:cx5="http://schemas.microsoft.com/office/drawing/2016/5/11/chartex" xmlns:cx6="http://schemas.microsoft.com/office/drawing/2016/5/12/chartex" xmlns:cx7="http://schemas.microsoft.com/office/drawing/2016/5/13/chartex" xmlns:cx8="http://schemas.microsoft.com/office/drawing/2016/5/14/chartex" xmlns:mc="http://schemas.openxmlformats.org/markup-compatibility/2006" xmlns:aink="http://schemas.microsoft.com/office/drawing/2016/ink" xmlns:am3d="http://schemas.microsoft.com/office/drawing/2017/model3d" xmlns:o="urn:schemas-microsoft-com:office:office" xmlns:oel="http://schemas.microsoft.com/office/2019/extlst" xmlns:r="http://schemas.openxmlformats.org/officeDocument/2006/relationships" xmlns:m="http://schemas.openxmlformats.org/officeDocument/2006/math" xmlns:v="urn:schemas-microsoft-com:vml" xmlns:wp14="http://schemas.microsoft.com/office/word/2010/wordprocessingDrawing" xmlns:wp="http://schemas.openxmlformats.org/drawingml/2006/wordprocessingDrawing" xmlns:w10="urn:schemas-microsoft-com:office:word" xmlns:w="http://schemas.openxmlformats.org/wordprocessingml/2006/main" xmlns:w14="http://schemas.microsoft.com/office/word/2010/wordml" xmlns:w15="http://schemas.microsoft.com/office/word/2012/wordml" xmlns:w16cex="http://schemas.microsoft.com/office/word/2018/wordml/cex" xmlns:w16cid="http://schemas.microsoft.com/office/word/2016/wordml/cid" xmlns:w16="http://schemas.microsoft.com/office/word/2018/wordml" xmlns:w16du="http://schemas.microsoft.com/office/word/2023/wordml/word16du" xmlns:w16sdtdh="http://schemas.microsoft.com/office/word/2020/wordml/sdtdatahash" xmlns:w16sdtfl="http://schemas.microsoft.com/office/word/2024/wordml/sdtformatlock" xmlns:w16se="http://schemas.microsoft.com/office/word/2015/wordml/symex" xmlns:wpg="http://schemas.microsoft.com/office/word/2010/wordprocessingGroup" xmlns:wpi="http://schemas.microsoft.com/office/word/2010/wordprocessingInk" xmlns:wne="http://schemas.microsoft.com/office/word/2006/wordml" xmlns:wps="http://schemas.microsoft.com/office/word/2010/wordprocessingShape" mc:Ignorable="w14 w15 w16se w16cid w16 w16cex w16sdtdh w16sdtfl w16du wp14">
+  <w:abstractNum w:abstractNumId="0" w15:restartNumberingAfterBreak="0">
+    <w:nsid w:val="69830BD8"/>
+    <w:multiLevelType w:val="multilevel"/>
+    <w:tmpl w:val="10F6EC64"/>
     <w:lvl w:ilvl="0">
       <w:start w:val="1"/>
       <w:numFmt w:val="bullet"/>
       <w:lvlText w:val=""/>
-      <w:lvlJc w:val="start"/>
+      <w:lvlJc w:val="left"/>
       <w:pPr>
         <w:tabs>
           <w:tab w:val="num" w:pos="720"/>
         </w:tabs>
-        <w:ind w:start="720" w:hanging="283"/>
+        <w:ind w:left="720" w:hanging="283"/>
       </w:pPr>
       <w:rPr>
         <w:rFonts w:ascii="Symbol" w:hAnsi="Symbol" w:cs="Symbol" w:hint="default"/>
@@ -341,111 +402,114 @@
       <w:start w:val="1"/>
       <w:numFmt w:val="decimal"/>
       <w:lvlText w:val="%2."/>
-      <w:lvlJc w:val="start"/>
+      <w:lvlJc w:val="left"/>
       <w:pPr>
         <w:tabs>
           <w:tab w:val="num" w:pos="1080"/>
         </w:tabs>
-        <w:ind w:start="1080" w:hanging="360"/>
+        <w:ind w:left="1080" w:hanging="360"/>
       </w:pPr>
     </w:lvl>
     <w:lvl w:ilvl="2">
       <w:start w:val="1"/>
       <w:numFmt w:val="decimal"/>
       <w:lvlText w:val="%3."/>
-      <w:lvlJc w:val="start"/>
+      <w:lvlJc w:val="left"/>
       <w:pPr>
         <w:tabs>
           <w:tab w:val="num" w:pos="1440"/>
         </w:tabs>
-        <w:ind w:start="1440" w:hanging="360"/>
+        <w:ind w:left="1440" w:hanging="360"/>
       </w:pPr>
     </w:lvl>
     <w:lvl w:ilvl="3">
       <w:start w:val="1"/>
       <w:numFmt w:val="decimal"/>
       <w:lvlText w:val="%4."/>
-      <w:lvlJc w:val="start"/>
+      <w:lvlJc w:val="left"/>
       <w:pPr>
         <w:tabs>
           <w:tab w:val="num" w:pos="1800"/>
         </w:tabs>
-        <w:ind w:start="1800" w:hanging="360"/>
+        <w:ind w:left="1800" w:hanging="360"/>
       </w:pPr>
     </w:lvl>
     <w:lvl w:ilvl="4">
       <w:start w:val="1"/>
       <w:numFmt w:val="decimal"/>
       <w:lvlText w:val="%5."/>
-      <w:lvlJc w:val="start"/>
+      <w:lvlJc w:val="left"/>
       <w:pPr>
         <w:tabs>
           <w:tab w:val="num" w:pos="2160"/>
         </w:tabs>
-        <w:ind w:start="2160" w:hanging="360"/>
+        <w:ind w:left="2160" w:hanging="360"/>
       </w:pPr>
     </w:lvl>
     <w:lvl w:ilvl="5">
       <w:start w:val="1"/>
       <w:numFmt w:val="decimal"/>
       <w:lvlText w:val="%6."/>
-      <w:lvlJc w:val="start"/>
+      <w:lvlJc w:val="left"/>
       <w:pPr>
         <w:tabs>
           <w:tab w:val="num" w:pos="2520"/>
         </w:tabs>
-        <w:ind w:start="2520" w:hanging="360"/>
+        <w:ind w:left="2520" w:hanging="360"/>
       </w:pPr>
     </w:lvl>
     <w:lvl w:ilvl="6">
       <w:start w:val="1"/>
       <w:numFmt w:val="decimal"/>
       <w:lvlText w:val="%7."/>
-      <w:lvlJc w:val="start"/>
+      <w:lvlJc w:val="left"/>
       <w:pPr>
         <w:tabs>
           <w:tab w:val="num" w:pos="2880"/>
         </w:tabs>
-        <w:ind w:start="2880" w:hanging="360"/>
+        <w:ind w:left="2880" w:hanging="360"/>
       </w:pPr>
     </w:lvl>
     <w:lvl w:ilvl="7">
       <w:start w:val="1"/>
       <w:numFmt w:val="decimal"/>
       <w:lvlText w:val="%8."/>
-      <w:lvlJc w:val="start"/>
+      <w:lvlJc w:val="left"/>
       <w:pPr>
         <w:tabs>
           <w:tab w:val="num" w:pos="3240"/>
         </w:tabs>
-        <w:ind w:start="3240" w:hanging="360"/>
+        <w:ind w:left="3240" w:hanging="360"/>
       </w:pPr>
     </w:lvl>
     <w:lvl w:ilvl="8">
       <w:start w:val="1"/>
       <w:numFmt w:val="decimal"/>
       <w:lvlText w:val="%9."/>
-      <w:lvlJc w:val="start"/>
+      <w:lvlJc w:val="left"/>
       <w:pPr>
         <w:tabs>
           <w:tab w:val="num" w:pos="3600"/>
         </w:tabs>
-        <w:ind w:start="3600" w:hanging="360"/>
+        <w:ind w:left="3600" w:hanging="360"/>
       </w:pPr>
     </w:lvl>
   </w:abstractNum>
-  <w:abstractNum w:abstractNumId="2">
+  <w:abstractNum w:abstractNumId="1" w15:restartNumberingAfterBreak="0">
+    <w:nsid w:val="6CE152F0"/>
+    <w:multiLevelType w:val="multilevel"/>
+    <w:tmpl w:val="EC680CA6"/>
     <w:lvl w:ilvl="0">
       <w:start w:val="1"/>
       <w:numFmt w:val="none"/>
       <w:suff w:val="nothing"/>
       <w:lvlText w:val=""/>
-      <w:lvlJc w:val="start"/>
+      <w:lvlJc w:val="left"/>
       <w:pPr>
         <w:tabs>
           <w:tab w:val="num" w:pos="0"/>
         </w:tabs>
-        <w:ind w:start="0" w:hanging="0"/>
+        <w:ind w:left="0" w:firstLine="0"/>
       </w:pPr>
     </w:lvl>
     <w:lvl w:ilvl="1">
@@ -453,12 +517,12 @@
       <w:numFmt w:val="none"/>
       <w:suff w:val="nothing"/>
       <w:lvlText w:val=""/>
-      <w:lvlJc w:val="start"/>
+      <w:lvlJc w:val="left"/>
       <w:pPr>
         <w:tabs>
           <w:tab w:val="num" w:pos="0"/>
         </w:tabs>
-        <w:ind w:start="0" w:hanging="0"/>
+        <w:ind w:left="0" w:firstLine="0"/>
       </w:pPr>
     </w:lvl>
     <w:lvl w:ilvl="2">
@@ -466,12 +530,12 @@
       <w:numFmt w:val="none"/>
       <w:suff w:val="nothing"/>
       <w:lvlText w:val=""/>
-      <w:lvlJc w:val="start"/>
+      <w:lvlJc w:val="left"/>
       <w:pPr>
         <w:tabs>
           <w:tab w:val="num" w:pos="0"/>
         </w:tabs>
-        <w:ind w:start="0" w:hanging="0"/>
+        <w:ind w:left="0" w:firstLine="0"/>
       </w:pPr>
     </w:lvl>
     <w:lvl w:ilvl="3">
@@ -479,12 +543,12 @@
       <w:numFmt w:val="none"/>
       <w:suff w:val="nothing"/>
       <w:lvlText w:val=""/>
-      <w:lvlJc w:val="start"/>
+      <w:lvlJc w:val="left"/>
       <w:pPr>
         <w:tabs>
           <w:tab w:val="num" w:pos="0"/>
         </w:tabs>
-        <w:ind w:start="0" w:hanging="0"/>
+        <w:ind w:left="0" w:firstLine="0"/>
       </w:pPr>
     </w:lvl>
     <w:lvl w:ilvl="4">
@@ -492,12 +556,12 @@
       <w:numFmt w:val="none"/>
       <w:suff w:val="nothing"/>
       <w:lvlText w:val=""/>
-      <w:lvlJc w:val="start"/>
+      <w:lvlJc w:val="left"/>
       <w:pPr>
         <w:tabs>
           <w:tab w:val="num" w:pos="0"/>
         </w:tabs>
-        <w:ind w:start="0" w:hanging="0"/>
+        <w:ind w:left="0" w:firstLine="0"/>
       </w:pPr>
     </w:lvl>
     <w:lvl w:ilvl="5">
@@ -505,12 +569,12 @@
       <w:numFmt w:val="none"/>
       <w:suff w:val="nothing"/>
       <w:lvlText w:val=""/>
-      <w:lvlJc w:val="start"/>
+      <w:lvlJc w:val="left"/>
       <w:pPr>
         <w:tabs>
           <w:tab w:val="num" w:pos="0"/>
         </w:tabs>
-        <w:ind w:start="0" w:hanging="0"/>
+        <w:ind w:left="0" w:firstLine="0"/>
       </w:pPr>
     </w:lvl>
     <w:lvl w:ilvl="6">
@@ -518,12 +582,12 @@
       <w:numFmt w:val="none"/>
       <w:suff w:val="nothing"/>
       <w:lvlText w:val=""/>
-      <w:lvlJc w:val="start"/>
+      <w:lvlJc w:val="left"/>
       <w:pPr>
         <w:tabs>
           <w:tab w:val="num" w:pos="0"/>
         </w:tabs>
-        <w:ind w:start="0" w:hanging="0"/>
+        <w:ind w:left="0" w:firstLine="0"/>
       </w:pPr>
     </w:lvl>
     <w:lvl w:ilvl="7">
@@ -531,12 +595,12 @@
       <w:numFmt w:val="none"/>
       <w:suff w:val="nothing"/>
       <w:lvlText w:val=""/>
-      <w:lvlJc w:val="start"/>
+      <w:lvlJc w:val="left"/>
       <w:pPr>
         <w:tabs>
           <w:tab w:val="num" w:pos="0"/>
         </w:tabs>
-        <w:ind w:start="0" w:hanging="0"/>
+        <w:ind w:left="0" w:firstLine="0"/>
       </w:pPr>
     </w:lvl>
     <w:lvl w:ilvl="8">
@@ -544,30 +608,30 @@
       <w:numFmt w:val="none"/>
       <w:suff w:val="nothing"/>
       <w:lvlText w:val=""/>
-      <w:lvlJc w:val="start"/>
+      <w:lvlJc w:val="left"/>
       <w:pPr>
         <w:tabs>
           <w:tab w:val="num" w:pos="0"/>
         </w:tabs>
-        <w:ind w:start="0" w:hanging="0"/>
+        <w:ind w:left="0" w:firstLine="0"/>
       </w:pPr>
     </w:lvl>
   </w:abstractNum>
-  <w:num w:numId="1">
+  <w:num w:numId="1" w16cid:durableId="692800349">
+    <w:abstractNumId w:val="0"/>
+  </w:num>
+  <w:num w:numId="2" w16cid:durableId="1211919620">
     <w:abstractNumId w:val="1"/>
-  </w:num>
-  <w:num w:numId="2">
-    <w:abstractNumId w:val="2"/>
   </w:num>
 </w:numbering>
 </file>
 
 <file path=word/styles.xml><?xml version="1.0" encoding="utf-8"?>
-<w:styles xmlns:w="http://schemas.openxmlformats.org/wordprocessingml/2006/main" xmlns:w14="http://schemas.microsoft.com/office/word/2010/wordml" xmlns:mc="http://schemas.openxmlformats.org/markup-compatibility/2006" mc:Ignorable="w14">
+<w:styles xmlns:mc="http://schemas.openxmlformats.org/markup-compatibility/2006" xmlns:r="http://schemas.openxmlformats.org/officeDocument/2006/relationships" xmlns:w="http://schemas.openxmlformats.org/wordprocessingml/2006/main" xmlns:w14="http://schemas.microsoft.com/office/word/2010/wordml" xmlns:w15="http://schemas.microsoft.com/office/word/2012/wordml" xmlns:w16cex="http://schemas.microsoft.com/office/word/2018/wordml/cex" xmlns:w16cid="http://schemas.microsoft.com/office/word/2016/wordml/cid" xmlns:w16="http://schemas.microsoft.com/office/word/2018/wordml" xmlns:w16du="http://schemas.microsoft.com/office/word/2023/wordml/word16du" xmlns:w16sdtdh="http://schemas.microsoft.com/office/word/2020/wordml/sdtdatahash" xmlns:w16sdtfl="http://schemas.microsoft.com/office/word/2024/wordml/sdtformatlock" xmlns:w16se="http://schemas.microsoft.com/office/word/2015/wordml/symex" mc:Ignorable="w14 w15 w16se w16cid w16 w16cex w16sdtdh w16sdtfl w16du">
   <w:docDefaults>
     <w:rPrDefault>
       <w:rPr>
-        <w:rFonts w:ascii="Liberation Serif" w:hAnsi="Liberation Serif" w:eastAsia="Noto Serif CJK SC" w:cs="Noto Sans"/>
+        <w:rFonts w:ascii="Liberation Serif" w:eastAsia="Noto Serif CJK SC" w:hAnsi="Liberation Serif" w:cs="Noto Sans"/>
         <w:kern w:val="2"/>
         <w:sz w:val="24"/>
         <w:szCs w:val="24"/>
@@ -576,35 +640,430 @@
     </w:rPrDefault>
     <w:pPrDefault>
       <w:pPr>
-        <w:widowControl/>
-        <w:suppressAutoHyphens w:val="true"/>
+        <w:suppressAutoHyphens/>
       </w:pPr>
     </w:pPrDefault>
   </w:docDefaults>
-  <w:style w:type="paragraph" w:styleId="Normal">
+  <w:latentStyles w:defLockedState="0" w:defUIPriority="99" w:defSemiHidden="0" w:defUnhideWhenUsed="0" w:defQFormat="0" w:count="376">
+    <w:lsdException w:name="Normal" w:uiPriority="0" w:qFormat="1"/>
+    <w:lsdException w:name="heading 1" w:uiPriority="9" w:qFormat="1"/>
+    <w:lsdException w:name="heading 2" w:semiHidden="1" w:uiPriority="9" w:unhideWhenUsed="1" w:qFormat="1"/>
+    <w:lsdException w:name="heading 3" w:semiHidden="1" w:uiPriority="9" w:unhideWhenUsed="1" w:qFormat="1"/>
+    <w:lsdException w:name="heading 4" w:semiHidden="1" w:uiPriority="9" w:unhideWhenUsed="1" w:qFormat="1"/>
+    <w:lsdException w:name="heading 5" w:semiHidden="1" w:uiPriority="9" w:unhideWhenUsed="1" w:qFormat="1"/>
+    <w:lsdException w:name="heading 6" w:semiHidden="1" w:uiPriority="9" w:unhideWhenUsed="1" w:qFormat="1"/>
+    <w:lsdException w:name="heading 7" w:semiHidden="1" w:uiPriority="9" w:unhideWhenUsed="1" w:qFormat="1"/>
+    <w:lsdException w:name="heading 8" w:semiHidden="1" w:uiPriority="9" w:unhideWhenUsed="1" w:qFormat="1"/>
+    <w:lsdException w:name="heading 9" w:semiHidden="1" w:uiPriority="9" w:unhideWhenUsed="1" w:qFormat="1"/>
+    <w:lsdException w:name="index 1" w:semiHidden="1" w:unhideWhenUsed="1"/>
+    <w:lsdException w:name="index 2" w:semiHidden="1" w:unhideWhenUsed="1"/>
+    <w:lsdException w:name="index 3" w:semiHidden="1" w:unhideWhenUsed="1"/>
+    <w:lsdException w:name="index 4" w:semiHidden="1" w:unhideWhenUsed="1"/>
+    <w:lsdException w:name="index 5" w:semiHidden="1" w:unhideWhenUsed="1"/>
+    <w:lsdException w:name="index 6" w:semiHidden="1" w:unhideWhenUsed="1"/>
+    <w:lsdException w:name="index 7" w:semiHidden="1" w:unhideWhenUsed="1"/>
+    <w:lsdException w:name="index 8" w:semiHidden="1" w:unhideWhenUsed="1"/>
+    <w:lsdException w:name="index 9" w:semiHidden="1" w:unhideWhenUsed="1"/>
+    <w:lsdException w:name="toc 1" w:semiHidden="1" w:uiPriority="39" w:unhideWhenUsed="1"/>
+    <w:lsdException w:name="toc 2" w:semiHidden="1" w:uiPriority="39" w:unhideWhenUsed="1"/>
+    <w:lsdException w:name="toc 3" w:semiHidden="1" w:uiPriority="39" w:unhideWhenUsed="1"/>
+    <w:lsdException w:name="toc 4" w:semiHidden="1" w:uiPriority="39" w:unhideWhenUsed="1"/>
+    <w:lsdException w:name="toc 5" w:semiHidden="1" w:uiPriority="39" w:unhideWhenUsed="1"/>
+    <w:lsdException w:name="toc 6" w:semiHidden="1" w:uiPriority="39" w:unhideWhenUsed="1"/>
+    <w:lsdException w:name="toc 7" w:semiHidden="1" w:uiPriority="39" w:unhideWhenUsed="1"/>
+    <w:lsdException w:name="toc 8" w:semiHidden="1" w:uiPriority="39" w:unhideWhenUsed="1"/>
+    <w:lsdException w:name="toc 9" w:semiHidden="1" w:uiPriority="39" w:unhideWhenUsed="1"/>
+    <w:lsdException w:name="Normal Indent" w:semiHidden="1" w:unhideWhenUsed="1"/>
+    <w:lsdException w:name="footnote text" w:semiHidden="1" w:unhideWhenUsed="1"/>
+    <w:lsdException w:name="annotation text" w:semiHidden="1" w:unhideWhenUsed="1"/>
+    <w:lsdException w:name="header" w:semiHidden="1" w:unhideWhenUsed="1"/>
+    <w:lsdException w:name="footer" w:semiHidden="1" w:unhideWhenUsed="1"/>
+    <w:lsdException w:name="index heading" w:semiHidden="1" w:unhideWhenUsed="1"/>
+    <w:lsdException w:name="caption" w:semiHidden="1" w:uiPriority="35" w:unhideWhenUsed="1" w:qFormat="1"/>
+    <w:lsdException w:name="table of figures" w:semiHidden="1" w:unhideWhenUsed="1"/>
+    <w:lsdException w:name="envelope address" w:semiHidden="1" w:unhideWhenUsed="1"/>
+    <w:lsdException w:name="envelope return" w:semiHidden="1" w:unhideWhenUsed="1"/>
+    <w:lsdException w:name="footnote reference" w:semiHidden="1" w:unhideWhenUsed="1"/>
+    <w:lsdException w:name="annotation reference" w:semiHidden="1" w:unhideWhenUsed="1"/>
+    <w:lsdException w:name="line number" w:semiHidden="1" w:unhideWhenUsed="1"/>
+    <w:lsdException w:name="page number" w:semiHidden="1" w:unhideWhenUsed="1"/>
+    <w:lsdException w:name="endnote reference" w:semiHidden="1" w:unhideWhenUsed="1"/>
+    <w:lsdException w:name="endnote text" w:semiHidden="1" w:unhideWhenUsed="1"/>
+    <w:lsdException w:name="table of authorities" w:semiHidden="1" w:unhideWhenUsed="1"/>
+    <w:lsdException w:name="macro" w:semiHidden="1" w:unhideWhenUsed="1"/>
+    <w:lsdException w:name="toa heading" w:semiHidden="1" w:unhideWhenUsed="1"/>
+    <w:lsdException w:name="List" w:semiHidden="1" w:unhideWhenUsed="1"/>
+    <w:lsdException w:name="List Bullet" w:semiHidden="1" w:unhideWhenUsed="1"/>
+    <w:lsdException w:name="List Number" w:semiHidden="1" w:unhideWhenUsed="1"/>
+    <w:lsdException w:name="List 2" w:semiHidden="1" w:unhideWhenUsed="1"/>
+    <w:lsdException w:name="List 3" w:semiHidden="1" w:unhideWhenUsed="1"/>
+    <w:lsdException w:name="List 4" w:semiHidden="1" w:unhideWhenUsed="1"/>
+    <w:lsdException w:name="List 5" w:semiHidden="1" w:unhideWhenUsed="1"/>
+    <w:lsdException w:name="List Bullet 2" w:semiHidden="1" w:unhideWhenUsed="1"/>
+    <w:lsdException w:name="List Bullet 3" w:semiHidden="1" w:unhideWhenUsed="1"/>
+    <w:lsdException w:name="List Bullet 4" w:semiHidden="1" w:unhideWhenUsed="1"/>
+    <w:lsdException w:name="List Bullet 5" w:semiHidden="1" w:unhideWhenUsed="1"/>
+    <w:lsdException w:name="List Number 2" w:semiHidden="1" w:unhideWhenUsed="1"/>
+    <w:lsdException w:name="List Number 3" w:semiHidden="1" w:unhideWhenUsed="1"/>
+    <w:lsdException w:name="List Number 4" w:semiHidden="1" w:unhideWhenUsed="1"/>
+    <w:lsdException w:name="List Number 5" w:semiHidden="1" w:unhideWhenUsed="1"/>
+    <w:lsdException w:name="Title" w:uiPriority="10" w:qFormat="1"/>
+    <w:lsdException w:name="Closing" w:semiHidden="1" w:unhideWhenUsed="1"/>
+    <w:lsdException w:name="Signature" w:semiHidden="1" w:unhideWhenUsed="1"/>
+    <w:lsdException w:name="Default Paragraph Font" w:semiHidden="1" w:uiPriority="1" w:unhideWhenUsed="1"/>
+    <w:lsdException w:name="Body Text" w:semiHidden="1" w:unhideWhenUsed="1"/>
+    <w:lsdException w:name="Body Text Indent" w:semiHidden="1" w:unhideWhenUsed="1"/>
+    <w:lsdException w:name="List Continue" w:semiHidden="1" w:unhideWhenUsed="1"/>
+    <w:lsdException w:name="List Continue 2" w:semiHidden="1" w:unhideWhenUsed="1"/>
+    <w:lsdException w:name="List Continue 3" w:semiHidden="1" w:unhideWhenUsed="1"/>
+    <w:lsdException w:name="List Continue 4" w:semiHidden="1" w:unhideWhenUsed="1"/>
+    <w:lsdException w:name="List Continue 5" w:semiHidden="1" w:unhideWhenUsed="1"/>
+    <w:lsdException w:name="Message Header" w:semiHidden="1" w:unhideWhenUsed="1"/>
+    <w:lsdException w:name="Subtitle" w:uiPriority="11" w:qFormat="1"/>
+    <w:lsdException w:name="Salutation" w:semiHidden="1" w:unhideWhenUsed="1"/>
+    <w:lsdException w:name="Date" w:semiHidden="1" w:unhideWhenUsed="1"/>
+    <w:lsdException w:name="Body Text First Indent" w:semiHidden="1" w:unhideWhenUsed="1"/>
+    <w:lsdException w:name="Body Text First Indent 2" w:semiHidden="1" w:unhideWhenUsed="1"/>
+    <w:lsdException w:name="Note Heading" w:semiHidden="1" w:unhideWhenUsed="1"/>
+    <w:lsdException w:name="Body Text 2" w:semiHidden="1" w:unhideWhenUsed="1"/>
+    <w:lsdException w:name="Body Text 3" w:semiHidden="1" w:unhideWhenUsed="1"/>
+    <w:lsdException w:name="Body Text Indent 2" w:semiHidden="1" w:unhideWhenUsed="1"/>
+    <w:lsdException w:name="Body Text Indent 3" w:semiHidden="1" w:unhideWhenUsed="1"/>
+    <w:lsdException w:name="Block Text" w:semiHidden="1" w:unhideWhenUsed="1"/>
+    <w:lsdException w:name="Hyperlink" w:semiHidden="1" w:unhideWhenUsed="1"/>
+    <w:lsdException w:name="FollowedHyperlink" w:semiHidden="1" w:unhideWhenUsed="1"/>
+    <w:lsdException w:name="Strong" w:uiPriority="22" w:qFormat="1"/>
+    <w:lsdException w:name="Emphasis" w:uiPriority="20" w:qFormat="1"/>
+    <w:lsdException w:name="Document Map" w:semiHidden="1" w:unhideWhenUsed="1"/>
+    <w:lsdException w:name="Plain Text" w:semiHidden="1" w:unhideWhenUsed="1"/>
+    <w:lsdException w:name="E-mail Signature" w:semiHidden="1" w:unhideWhenUsed="1"/>
+    <w:lsdException w:name="HTML Top of Form" w:semiHidden="1" w:unhideWhenUsed="1"/>
+    <w:lsdException w:name="HTML Bottom of Form" w:semiHidden="1" w:unhideWhenUsed="1"/>
+    <w:lsdException w:name="Normal (Web)" w:semiHidden="1" w:unhideWhenUsed="1"/>
+    <w:lsdException w:name="HTML Acronym" w:semiHidden="1" w:unhideWhenUsed="1"/>
+    <w:lsdException w:name="HTML Address" w:semiHidden="1" w:unhideWhenUsed="1"/>
+    <w:lsdException w:name="HTML Cite" w:semiHidden="1" w:unhideWhenUsed="1"/>
+    <w:lsdException w:name="HTML Code" w:semiHidden="1" w:unhideWhenUsed="1"/>
+    <w:lsdException w:name="HTML Definition" w:semiHidden="1" w:unhideWhenUsed="1"/>
+    <w:lsdException w:name="HTML Keyboard" w:semiHidden="1" w:unhideWhenUsed="1"/>
+    <w:lsdException w:name="HTML Preformatted" w:semiHidden="1" w:unhideWhenUsed="1"/>
+    <w:lsdException w:name="HTML Sample" w:semiHidden="1" w:unhideWhenUsed="1"/>
+    <w:lsdException w:name="HTML Typewriter" w:semiHidden="1" w:unhideWhenUsed="1"/>
+    <w:lsdException w:name="HTML Variable" w:semiHidden="1" w:unhideWhenUsed="1"/>
+    <w:lsdException w:name="Normal Table" w:semiHidden="1" w:unhideWhenUsed="1"/>
+    <w:lsdException w:name="annotation subject" w:semiHidden="1" w:unhideWhenUsed="1"/>
+    <w:lsdException w:name="No List" w:semiHidden="1" w:unhideWhenUsed="1"/>
+    <w:lsdException w:name="Outline List 1" w:semiHidden="1" w:unhideWhenUsed="1"/>
+    <w:lsdException w:name="Outline List 2" w:semiHidden="1" w:unhideWhenUsed="1"/>
+    <w:lsdException w:name="Outline List 3" w:semiHidden="1" w:unhideWhenUsed="1"/>
+    <w:lsdException w:name="Table Simple 1" w:semiHidden="1" w:unhideWhenUsed="1"/>
+    <w:lsdException w:name="Table Simple 2" w:semiHidden="1" w:unhideWhenUsed="1"/>
+    <w:lsdException w:name="Table Simple 3" w:semiHidden="1" w:unhideWhenUsed="1"/>
+    <w:lsdException w:name="Table Classic 1" w:semiHidden="1" w:unhideWhenUsed="1"/>
+    <w:lsdException w:name="Table Classic 2" w:semiHidden="1" w:unhideWhenUsed="1"/>
+    <w:lsdException w:name="Table Classic 3" w:semiHidden="1" w:unhideWhenUsed="1"/>
+    <w:lsdException w:name="Table Classic 4" w:semiHidden="1" w:unhideWhenUsed="1"/>
+    <w:lsdException w:name="Table Colorful 1" w:semiHidden="1" w:unhideWhenUsed="1"/>
+    <w:lsdException w:name="Table Colorful 2" w:semiHidden="1" w:unhideWhenUsed="1"/>
+    <w:lsdException w:name="Table Colorful 3" w:semiHidden="1" w:unhideWhenUsed="1"/>
+    <w:lsdException w:name="Table Columns 1" w:semiHidden="1" w:unhideWhenUsed="1"/>
+    <w:lsdException w:name="Table Columns 2" w:semiHidden="1" w:unhideWhenUsed="1"/>
+    <w:lsdException w:name="Table Columns 3" w:semiHidden="1" w:unhideWhenUsed="1"/>
+    <w:lsdException w:name="Table Columns 4" w:semiHidden="1" w:unhideWhenUsed="1"/>
+    <w:lsdException w:name="Table Columns 5" w:semiHidden="1" w:unhideWhenUsed="1"/>
+    <w:lsdException w:name="Table Grid 1" w:semiHidden="1" w:unhideWhenUsed="1"/>
+    <w:lsdException w:name="Table Grid 2" w:semiHidden="1" w:unhideWhenUsed="1"/>
+    <w:lsdException w:name="Table Grid 3" w:semiHidden="1" w:unhideWhenUsed="1"/>
+    <w:lsdException w:name="Table Grid 4" w:semiHidden="1" w:unhideWhenUsed="1"/>
+    <w:lsdException w:name="Table Grid 5" w:semiHidden="1" w:unhideWhenUsed="1"/>
+    <w:lsdException w:name="Table Grid 6" w:semiHidden="1" w:unhideWhenUsed="1"/>
+    <w:lsdException w:name="Table Grid 7" w:semiHidden="1" w:unhideWhenUsed="1"/>
+    <w:lsdException w:name="Table Grid 8" w:semiHidden="1" w:unhideWhenUsed="1"/>
+    <w:lsdException w:name="Table List 1" w:semiHidden="1" w:unhideWhenUsed="1"/>
+    <w:lsdException w:name="Table List 2" w:semiHidden="1" w:unhideWhenUsed="1"/>
+    <w:lsdException w:name="Table List 3" w:semiHidden="1" w:unhideWhenUsed="1"/>
+    <w:lsdException w:name="Table List 4" w:semiHidden="1" w:unhideWhenUsed="1"/>
+    <w:lsdException w:name="Table List 5" w:semiHidden="1" w:unhideWhenUsed="1"/>
+    <w:lsdException w:name="Table List 6" w:semiHidden="1" w:unhideWhenUsed="1"/>
+    <w:lsdException w:name="Table List 7" w:semiHidden="1" w:unhideWhenUsed="1"/>
+    <w:lsdException w:name="Table List 8" w:semiHidden="1" w:unhideWhenUsed="1"/>
+    <w:lsdException w:name="Table 3D effects 1" w:semiHidden="1" w:unhideWhenUsed="1"/>
+    <w:lsdException w:name="Table 3D effects 2" w:semiHidden="1" w:unhideWhenUsed="1"/>
+    <w:lsdException w:name="Table 3D effects 3" w:semiHidden="1" w:unhideWhenUsed="1"/>
+    <w:lsdException w:name="Table Contemporary" w:semiHidden="1" w:unhideWhenUsed="1"/>
+    <w:lsdException w:name="Table Elegant" w:semiHidden="1" w:unhideWhenUsed="1"/>
+    <w:lsdException w:name="Table Professional" w:semiHidden="1" w:unhideWhenUsed="1"/>
+    <w:lsdException w:name="Table Subtle 1" w:semiHidden="1" w:unhideWhenUsed="1"/>
+    <w:lsdException w:name="Table Subtle 2" w:semiHidden="1" w:unhideWhenUsed="1"/>
+    <w:lsdException w:name="Table Web 1" w:semiHidden="1" w:unhideWhenUsed="1"/>
+    <w:lsdException w:name="Table Web 2" w:semiHidden="1" w:unhideWhenUsed="1"/>
+    <w:lsdException w:name="Table Web 3" w:semiHidden="1" w:unhideWhenUsed="1"/>
+    <w:lsdException w:name="Balloon Text" w:semiHidden="1" w:unhideWhenUsed="1"/>
+    <w:lsdException w:name="Table Grid" w:uiPriority="39"/>
+    <w:lsdException w:name="Table Theme" w:semiHidden="1" w:unhideWhenUsed="1"/>
+    <w:lsdException w:name="Placeholder Text" w:semiHidden="1"/>
+    <w:lsdException w:name="No Spacing" w:uiPriority="1" w:qFormat="1"/>
+    <w:lsdException w:name="Light Shading" w:uiPriority="60"/>
+    <w:lsdException w:name="Light List" w:uiPriority="61"/>
+    <w:lsdException w:name="Light Grid" w:uiPriority="62"/>
+    <w:lsdException w:name="Medium Shading 1" w:uiPriority="63"/>
+    <w:lsdException w:name="Medium Shading 2" w:uiPriority="64"/>
+    <w:lsdException w:name="Medium List 1" w:uiPriority="65"/>
+    <w:lsdException w:name="Medium List 2" w:uiPriority="66"/>
+    <w:lsdException w:name="Medium Grid 1" w:uiPriority="67"/>
+    <w:lsdException w:name="Medium Grid 2" w:uiPriority="68"/>
+    <w:lsdException w:name="Medium Grid 3" w:uiPriority="69"/>
+    <w:lsdException w:name="Dark List" w:uiPriority="70"/>
+    <w:lsdException w:name="Colorful Shading" w:uiPriority="71"/>
+    <w:lsdException w:name="Colorful List" w:uiPriority="72"/>
+    <w:lsdException w:name="Colorful Grid" w:uiPriority="73"/>
+    <w:lsdException w:name="Light Shading Accent 1" w:uiPriority="60"/>
+    <w:lsdException w:name="Light List Accent 1" w:uiPriority="61"/>
+    <w:lsdException w:name="Light Grid Accent 1" w:uiPriority="62"/>
+    <w:lsdException w:name="Medium Shading 1 Accent 1" w:uiPriority="63"/>
+    <w:lsdException w:name="Medium Shading 2 Accent 1" w:uiPriority="64"/>
+    <w:lsdException w:name="Medium List 1 Accent 1" w:uiPriority="65"/>
+    <w:lsdException w:name="Revision" w:semiHidden="1"/>
+    <w:lsdException w:name="List Paragraph" w:uiPriority="34" w:qFormat="1"/>
+    <w:lsdException w:name="Quote" w:uiPriority="29" w:qFormat="1"/>
+    <w:lsdException w:name="Intense Quote" w:uiPriority="30" w:qFormat="1"/>
+    <w:lsdException w:name="Medium List 2 Accent 1" w:uiPriority="66"/>
+    <w:lsdException w:name="Medium Grid 1 Accent 1" w:uiPriority="67"/>
+    <w:lsdException w:name="Medium Grid 2 Accent 1" w:uiPriority="68"/>
+    <w:lsdException w:name="Medium Grid 3 Accent 1" w:uiPriority="69"/>
+    <w:lsdException w:name="Dark List Accent 1" w:uiPriority="70"/>
+    <w:lsdException w:name="Colorful Shading Accent 1" w:uiPriority="71"/>
+    <w:lsdException w:name="Colorful List Accent 1" w:uiPriority="72"/>
+    <w:lsdException w:name="Colorful Grid Accent 1" w:uiPriority="73"/>
+    <w:lsdException w:name="Light Shading Accent 2" w:uiPriority="60"/>
+    <w:lsdException w:name="Light List Accent 2" w:uiPriority="61"/>
+    <w:lsdException w:name="Light Grid Accent 2" w:uiPriority="62"/>
+    <w:lsdException w:name="Medium Shading 1 Accent 2" w:uiPriority="63"/>
+    <w:lsdException w:name="Medium Shading 2 Accent 2" w:uiPriority="64"/>
+    <w:lsdException w:name="Medium List 1 Accent 2" w:uiPriority="65"/>
+    <w:lsdException w:name="Medium List 2 Accent 2" w:uiPriority="66"/>
+    <w:lsdException w:name="Medium Grid 1 Accent 2" w:uiPriority="67"/>
+    <w:lsdException w:name="Medium Grid 2 Accent 2" w:uiPriority="68"/>
+    <w:lsdException w:name="Medium Grid 3 Accent 2" w:uiPriority="69"/>
+    <w:lsdException w:name="Dark List Accent 2" w:uiPriority="70"/>
+    <w:lsdException w:name="Colorful Shading Accent 2" w:uiPriority="71"/>
+    <w:lsdException w:name="Colorful List Accent 2" w:uiPriority="72"/>
+    <w:lsdException w:name="Colorful Grid Accent 2" w:uiPriority="73"/>
+    <w:lsdException w:name="Light Shading Accent 3" w:uiPriority="60"/>
+    <w:lsdException w:name="Light List Accent 3" w:uiPriority="61"/>
+    <w:lsdException w:name="Light Grid Accent 3" w:uiPriority="62"/>
+    <w:lsdException w:name="Medium Shading 1 Accent 3" w:uiPriority="63"/>
+    <w:lsdException w:name="Medium Shading 2 Accent 3" w:uiPriority="64"/>
+    <w:lsdException w:name="Medium List 1 Accent 3" w:uiPriority="65"/>
+    <w:lsdException w:name="Medium List 2 Accent 3" w:uiPriority="66"/>
+    <w:lsdException w:name="Medium Grid 1 Accent 3" w:uiPriority="67"/>
+    <w:lsdException w:name="Medium Grid 2 Accent 3" w:uiPriority="68"/>
+    <w:lsdException w:name="Medium Grid 3 Accent 3" w:uiPriority="69"/>
+    <w:lsdException w:name="Dark List Accent 3" w:uiPriority="70"/>
+    <w:lsdException w:name="Colorful Shading Accent 3" w:uiPriority="71"/>
+    <w:lsdException w:name="Colorful List Accent 3" w:uiPriority="72"/>
+    <w:lsdException w:name="Colorful Grid Accent 3" w:uiPriority="73"/>
+    <w:lsdException w:name="Light Shading Accent 4" w:uiPriority="60"/>
+    <w:lsdException w:name="Light List Accent 4" w:uiPriority="61"/>
+    <w:lsdException w:name="Light Grid Accent 4" w:uiPriority="62"/>
+    <w:lsdException w:name="Medium Shading 1 Accent 4" w:uiPriority="63"/>
+    <w:lsdException w:name="Medium Shading 2 Accent 4" w:uiPriority="64"/>
+    <w:lsdException w:name="Medium List 1 Accent 4" w:uiPriority="65"/>
+    <w:lsdException w:name="Medium List 2 Accent 4" w:uiPriority="66"/>
+    <w:lsdException w:name="Medium Grid 1 Accent 4" w:uiPriority="67"/>
+    <w:lsdException w:name="Medium Grid 2 Accent 4" w:uiPriority="68"/>
+    <w:lsdException w:name="Medium Grid 3 Accent 4" w:uiPriority="69"/>
+    <w:lsdException w:name="Dark List Accent 4" w:uiPriority="70"/>
+    <w:lsdException w:name="Colorful Shading Accent 4" w:uiPriority="71"/>
+    <w:lsdException w:name="Colorful List Accent 4" w:uiPriority="72"/>
+    <w:lsdException w:name="Colorful Grid Accent 4" w:uiPriority="73"/>
+    <w:lsdException w:name="Light Shading Accent 5" w:uiPriority="60"/>
+    <w:lsdException w:name="Light List Accent 5" w:uiPriority="61"/>
+    <w:lsdException w:name="Light Grid Accent 5" w:uiPriority="62"/>
+    <w:lsdException w:name="Medium Shading 1 Accent 5" w:uiPriority="63"/>
+    <w:lsdException w:name="Medium Shading 2 Accent 5" w:uiPriority="64"/>
+    <w:lsdException w:name="Medium List 1 Accent 5" w:uiPriority="65"/>
+    <w:lsdException w:name="Medium List 2 Accent 5" w:uiPriority="66"/>
+    <w:lsdException w:name="Medium Grid 1 Accent 5" w:uiPriority="67"/>
+    <w:lsdException w:name="Medium Grid 2 Accent 5" w:uiPriority="68"/>
+    <w:lsdException w:name="Medium Grid 3 Accent 5" w:uiPriority="69"/>
+    <w:lsdException w:name="Dark List Accent 5" w:uiPriority="70"/>
+    <w:lsdException w:name="Colorful Shading Accent 5" w:uiPriority="71"/>
+    <w:lsdException w:name="Colorful List Accent 5" w:uiPriority="72"/>
+    <w:lsdException w:name="Colorful Grid Accent 5" w:uiPriority="73"/>
+    <w:lsdException w:name="Light Shading Accent 6" w:uiPriority="60"/>
+    <w:lsdException w:name="Light List Accent 6" w:uiPriority="61"/>
+    <w:lsdException w:name="Light Grid Accent 6" w:uiPriority="62"/>
+    <w:lsdException w:name="Medium Shading 1 Accent 6" w:uiPriority="63"/>
+    <w:lsdException w:name="Medium Shading 2 Accent 6" w:uiPriority="64"/>
+    <w:lsdException w:name="Medium List 1 Accent 6" w:uiPriority="65"/>
+    <w:lsdException w:name="Medium List 2 Accent 6" w:uiPriority="66"/>
+    <w:lsdException w:name="Medium Grid 1 Accent 6" w:uiPriority="67"/>
+    <w:lsdException w:name="Medium Grid 2 Accent 6" w:uiPriority="68"/>
+    <w:lsdException w:name="Medium Grid 3 Accent 6" w:uiPriority="69"/>
+    <w:lsdException w:name="Dark List Accent 6" w:uiPriority="70"/>
+    <w:lsdException w:name="Colorful Shading Accent 6" w:uiPriority="71"/>
+    <w:lsdException w:name="Colorful List Accent 6" w:uiPriority="72"/>
+    <w:lsdException w:name="Colorful Grid Accent 6" w:uiPriority="73"/>
+    <w:lsdException w:name="Subtle Emphasis" w:uiPriority="19" w:qFormat="1"/>
+    <w:lsdException w:name="Intense Emphasis" w:uiPriority="21" w:qFormat="1"/>
+    <w:lsdException w:name="Subtle Reference" w:uiPriority="31" w:qFormat="1"/>
+    <w:lsdException w:name="Intense Reference" w:uiPriority="32" w:qFormat="1"/>
+    <w:lsdException w:name="Book Title" w:uiPriority="33" w:qFormat="1"/>
+    <w:lsdException w:name="Bibliography" w:semiHidden="1" w:uiPriority="37" w:unhideWhenUsed="1"/>
+    <w:lsdException w:name="TOC Heading" w:semiHidden="1" w:uiPriority="39" w:unhideWhenUsed="1" w:qFormat="1"/>
+    <w:lsdException w:name="Plain Table 1" w:uiPriority="41"/>
+    <w:lsdException w:name="Plain Table 2" w:uiPriority="42"/>
+    <w:lsdException w:name="Plain Table 3" w:uiPriority="43"/>
+    <w:lsdException w:name="Plain Table 4" w:uiPriority="44"/>
+    <w:lsdException w:name="Plain Table 5" w:uiPriority="45"/>
+    <w:lsdException w:name="Grid Table Light" w:uiPriority="40"/>
+    <w:lsdException w:name="Grid Table 1 Light" w:uiPriority="46"/>
+    <w:lsdException w:name="Grid Table 2" w:uiPriority="47"/>
+    <w:lsdException w:name="Grid Table 3" w:uiPriority="48"/>
+    <w:lsdException w:name="Grid Table 4" w:uiPriority="49"/>
+    <w:lsdException w:name="Grid Table 5 Dark" w:uiPriority="50"/>
+    <w:lsdException w:name="Grid Table 6 Colorful" w:uiPriority="51"/>
+    <w:lsdException w:name="Grid Table 7 Colorful" w:uiPriority="52"/>
+    <w:lsdException w:name="Grid Table 1 Light Accent 1" w:uiPriority="46"/>
+    <w:lsdException w:name="Grid Table 2 Accent 1" w:uiPriority="47"/>
+    <w:lsdException w:name="Grid Table 3 Accent 1" w:uiPriority="48"/>
+    <w:lsdException w:name="Grid Table 4 Accent 1" w:uiPriority="49"/>
+    <w:lsdException w:name="Grid Table 5 Dark Accent 1" w:uiPriority="50"/>
+    <w:lsdException w:name="Grid Table 6 Colorful Accent 1" w:uiPriority="51"/>
+    <w:lsdException w:name="Grid Table 7 Colorful Accent 1" w:uiPriority="52"/>
+    <w:lsdException w:name="Grid Table 1 Light Accent 2" w:uiPriority="46"/>
+    <w:lsdException w:name="Grid Table 2 Accent 2" w:uiPriority="47"/>
+    <w:lsdException w:name="Grid Table 3 Accent 2" w:uiPriority="48"/>
+    <w:lsdException w:name="Grid Table 4 Accent 2" w:uiPriority="49"/>
+    <w:lsdException w:name="Grid Table 5 Dark Accent 2" w:uiPriority="50"/>
+    <w:lsdException w:name="Grid Table 6 Colorful Accent 2" w:uiPriority="51"/>
+    <w:lsdException w:name="Grid Table 7 Colorful Accent 2" w:uiPriority="52"/>
+    <w:lsdException w:name="Grid Table 1 Light Accent 3" w:uiPriority="46"/>
+    <w:lsdException w:name="Grid Table 2 Accent 3" w:uiPriority="47"/>
+    <w:lsdException w:name="Grid Table 3 Accent 3" w:uiPriority="48"/>
+    <w:lsdException w:name="Grid Table 4 Accent 3" w:uiPriority="49"/>
+    <w:lsdException w:name="Grid Table 5 Dark Accent 3" w:uiPriority="50"/>
+    <w:lsdException w:name="Grid Table 6 Colorful Accent 3" w:uiPriority="51"/>
+    <w:lsdException w:name="Grid Table 7 Colorful Accent 3" w:uiPriority="52"/>
+    <w:lsdException w:name="Grid Table 1 Light Accent 4" w:uiPriority="46"/>
+    <w:lsdException w:name="Grid Table 2 Accent 4" w:uiPriority="47"/>
+    <w:lsdException w:name="Grid Table 3 Accent 4" w:uiPriority="48"/>
+    <w:lsdException w:name="Grid Table 4 Accent 4" w:uiPriority="49"/>
+    <w:lsdException w:name="Grid Table 5 Dark Accent 4" w:uiPriority="50"/>
+    <w:lsdException w:name="Grid Table 6 Colorful Accent 4" w:uiPriority="51"/>
+    <w:lsdException w:name="Grid Table 7 Colorful Accent 4" w:uiPriority="52"/>
+    <w:lsdException w:name="Grid Table 1 Light Accent 5" w:uiPriority="46"/>
+    <w:lsdException w:name="Grid Table 2 Accent 5" w:uiPriority="47"/>
+    <w:lsdException w:name="Grid Table 3 Accent 5" w:uiPriority="48"/>
+    <w:lsdException w:name="Grid Table 4 Accent 5" w:uiPriority="49"/>
+    <w:lsdException w:name="Grid Table 5 Dark Accent 5" w:uiPriority="50"/>
+    <w:lsdException w:name="Grid Table 6 Colorful Accent 5" w:uiPriority="51"/>
+    <w:lsdException w:name="Grid Table 7 Colorful Accent 5" w:uiPriority="52"/>
+    <w:lsdException w:name="Grid Table 1 Light Accent 6" w:uiPriority="46"/>
+    <w:lsdException w:name="Grid Table 2 Accent 6" w:uiPriority="47"/>
+    <w:lsdException w:name="Grid Table 3 Accent 6" w:uiPriority="48"/>
+    <w:lsdException w:name="Grid Table 4 Accent 6" w:uiPriority="49"/>
+    <w:lsdException w:name="Grid Table 5 Dark Accent 6" w:uiPriority="50"/>
+    <w:lsdException w:name="Grid Table 6 Colorful Accent 6" w:uiPriority="51"/>
+    <w:lsdException w:name="Grid Table 7 Colorful Accent 6" w:uiPriority="52"/>
+    <w:lsdException w:name="List Table 1 Light" w:uiPriority="46"/>
+    <w:lsdException w:name="List Table 2" w:uiPriority="47"/>
+    <w:lsdException w:name="List Table 3" w:uiPriority="48"/>
+    <w:lsdException w:name="List Table 4" w:uiPriority="49"/>
+    <w:lsdException w:name="List Table 5 Dark" w:uiPriority="50"/>
+    <w:lsdException w:name="List Table 6 Colorful" w:uiPriority="51"/>
+    <w:lsdException w:name="List Table 7 Colorful" w:uiPriority="52"/>
+    <w:lsdException w:name="List Table 1 Light Accent 1" w:uiPriority="46"/>
+    <w:lsdException w:name="List Table 2 Accent 1" w:uiPriority="47"/>
+    <w:lsdException w:name="List Table 3 Accent 1" w:uiPriority="48"/>
+    <w:lsdException w:name="List Table 4 Accent 1" w:uiPriority="49"/>
+    <w:lsdException w:name="List Table 5 Dark Accent 1" w:uiPriority="50"/>
+    <w:lsdException w:name="List Table 6 Colorful Accent 1" w:uiPriority="51"/>
+    <w:lsdException w:name="List Table 7 Colorful Accent 1" w:uiPriority="52"/>
+    <w:lsdException w:name="List Table 1 Light Accent 2" w:uiPriority="46"/>
+    <w:lsdException w:name="List Table 2 Accent 2" w:uiPriority="47"/>
+    <w:lsdException w:name="List Table 3 Accent 2" w:uiPriority="48"/>
+    <w:lsdException w:name="List Table 4 Accent 2" w:uiPriority="49"/>
+    <w:lsdException w:name="List Table 5 Dark Accent 2" w:uiPriority="50"/>
+    <w:lsdException w:name="List Table 6 Colorful Accent 2" w:uiPriority="51"/>
+    <w:lsdException w:name="List Table 7 Colorful Accent 2" w:uiPriority="52"/>
+    <w:lsdException w:name="List Table 1 Light Accent 3" w:uiPriority="46"/>
+    <w:lsdException w:name="List Table 2 Accent 3" w:uiPriority="47"/>
+    <w:lsdException w:name="List Table 3 Accent 3" w:uiPriority="48"/>
+    <w:lsdException w:name="List Table 4 Accent 3" w:uiPriority="49"/>
+    <w:lsdException w:name="List Table 5 Dark Accent 3" w:uiPriority="50"/>
+    <w:lsdException w:name="List Table 6 Colorful Accent 3" w:uiPriority="51"/>
+    <w:lsdException w:name="List Table 7 Colorful Accent 3" w:uiPriority="52"/>
+    <w:lsdException w:name="List Table 1 Light Accent 4" w:uiPriority="46"/>
+    <w:lsdException w:name="List Table 2 Accent 4" w:uiPriority="47"/>
+    <w:lsdException w:name="List Table 3 Accent 4" w:uiPriority="48"/>
+    <w:lsdException w:name="List Table 4 Accent 4" w:uiPriority="49"/>
+    <w:lsdException w:name="List Table 5 Dark Accent 4" w:uiPriority="50"/>
+    <w:lsdException w:name="List Table 6 Colorful Accent 4" w:uiPriority="51"/>
+    <w:lsdException w:name="List Table 7 Colorful Accent 4" w:uiPriority="52"/>
+    <w:lsdException w:name="List Table 1 Light Accent 5" w:uiPriority="46"/>
+    <w:lsdException w:name="List Table 2 Accent 5" w:uiPriority="47"/>
+    <w:lsdException w:name="List Table 3 Accent 5" w:uiPriority="48"/>
+    <w:lsdException w:name="List Table 4 Accent 5" w:uiPriority="49"/>
+    <w:lsdException w:name="List Table 5 Dark Accent 5" w:uiPriority="50"/>
+    <w:lsdException w:name="List Table 6 Colorful Accent 5" w:uiPriority="51"/>
+    <w:lsdException w:name="List Table 7 Colorful Accent 5" w:uiPriority="52"/>
+    <w:lsdException w:name="List Table 1 Light Accent 6" w:uiPriority="46"/>
+    <w:lsdException w:name="List Table 2 Accent 6" w:uiPriority="47"/>
+    <w:lsdException w:name="List Table 3 Accent 6" w:uiPriority="48"/>
+    <w:lsdException w:name="List Table 4 Accent 6" w:uiPriority="49"/>
+    <w:lsdException w:name="List Table 5 Dark Accent 6" w:uiPriority="50"/>
+    <w:lsdException w:name="List Table 6 Colorful Accent 6" w:uiPriority="51"/>
+    <w:lsdException w:name="List Table 7 Colorful Accent 6" w:uiPriority="52"/>
+    <w:lsdException w:name="Mention" w:semiHidden="1" w:unhideWhenUsed="1"/>
+    <w:lsdException w:name="Smart Hyperlink" w:semiHidden="1" w:unhideWhenUsed="1"/>
+    <w:lsdException w:name="Hashtag" w:semiHidden="1" w:unhideWhenUsed="1"/>
+    <w:lsdException w:name="Unresolved Mention" w:semiHidden="1" w:unhideWhenUsed="1"/>
+    <w:lsdException w:name="Smart Link" w:semiHidden="1" w:unhideWhenUsed="1"/>
+  </w:latentStyles>
+  <w:style w:type="paragraph" w:default="1" w:styleId="Normale">
     <w:name w:val="Normal"/>
     <w:qFormat/>
-    <w:pPr>
-      <w:widowControl/>
-      <w:bidi w:val="0"/>
-    </w:pPr>
     <w:rPr>
-      <w:rFonts w:ascii="Aptos" w:hAnsi="Aptos" w:eastAsia="Noto Serif CJK SC" w:cs="Noto Sans"/>
-      <w:color w:val="auto"/>
-      <w:kern w:val="2"/>
-      <w:sz w:val="24"/>
-      <w:szCs w:val="24"/>
-      <w:lang w:val="en-GB" w:eastAsia="zh-CN" w:bidi="hi-IN"/>
+      <w:rFonts w:ascii="Aptos" w:hAnsi="Aptos"/>
     </w:rPr>
   </w:style>
-  <w:style w:type="character" w:styleId="Bullets">
+  <w:style w:type="character" w:default="1" w:styleId="Carpredefinitoparagrafo">
+    <w:name w:val="Default Paragraph Font"/>
+    <w:uiPriority w:val="1"/>
+    <w:semiHidden/>
+    <w:unhideWhenUsed/>
+  </w:style>
+  <w:style w:type="table" w:default="1" w:styleId="Tabellanormale">
+    <w:name w:val="Normal Table"/>
+    <w:uiPriority w:val="99"/>
+    <w:semiHidden/>
+    <w:unhideWhenUsed/>
+    <w:tblPr>
+      <w:tblInd w:w="0" w:type="dxa"/>
+      <w:tblCellMar>
+        <w:top w:w="0" w:type="dxa"/>
+        <w:left w:w="108" w:type="dxa"/>
+        <w:bottom w:w="0" w:type="dxa"/>
+        <w:right w:w="108" w:type="dxa"/>
+      </w:tblCellMar>
+    </w:tblPr>
+  </w:style>
+  <w:style w:type="numbering" w:default="1" w:styleId="Nessunelenco">
+    <w:name w:val="No List"/>
+    <w:uiPriority w:val="99"/>
+    <w:semiHidden/>
+    <w:unhideWhenUsed/>
+  </w:style>
+  <w:style w:type="character" w:customStyle="1" w:styleId="Bullets">
     <w:name w:val="Bullets"/>
     <w:qFormat/>
     <w:rPr>
-      <w:rFonts w:ascii="OpenSymbol" w:hAnsi="OpenSymbol" w:eastAsia="OpenSymbol" w:cs="OpenSymbol"/>
+      <w:rFonts w:ascii="OpenSymbol" w:eastAsia="OpenSymbol" w:hAnsi="OpenSymbol" w:cs="OpenSymbol"/>
     </w:rPr>
   </w:style>
-  <w:style w:type="character" w:styleId="Emphasis">
+  <w:style w:type="character" w:styleId="Enfasicorsivo">
     <w:name w:val="Emphasis"/>
     <w:qFormat/>
     <w:rPr>
@@ -612,83 +1071,84 @@
       <w:iCs/>
     </w:rPr>
   </w:style>
-  <w:style w:type="character" w:styleId="Hyperlink">
+  <w:style w:type="character" w:styleId="Collegamentoipertestuale">
     <w:name w:val="Hyperlink"/>
     <w:rPr>
       <w:color w:val="000080"/>
       <w:u w:val="single"/>
     </w:rPr>
   </w:style>
-  <w:style w:type="character" w:styleId="FollowedHyperlink">
+  <w:style w:type="character" w:styleId="Collegamentovisitato">
     <w:name w:val="FollowedHyperlink"/>
     <w:rPr>
       <w:color w:val="800000"/>
       <w:u w:val="single"/>
     </w:rPr>
   </w:style>
-  <w:style w:type="paragraph" w:styleId="Heading">
+  <w:style w:type="paragraph" w:customStyle="1" w:styleId="Heading">
     <w:name w:val="Heading"/>
-    <w:basedOn w:val="Normal"/>
-    <w:next w:val="BodyText"/>
+    <w:basedOn w:val="Normale"/>
+    <w:next w:val="Corpotesto"/>
     <w:qFormat/>
     <w:pPr>
-      <w:keepNext w:val="true"/>
+      <w:keepNext/>
       <w:spacing w:before="240" w:after="120"/>
     </w:pPr>
     <w:rPr>
-      <w:rFonts w:ascii="Liberation Sans" w:hAnsi="Liberation Sans" w:eastAsia="Noto Sans CJK SC" w:cs="Noto Sans"/>
+      <w:rFonts w:ascii="Liberation Sans" w:eastAsia="Noto Sans CJK SC" w:hAnsi="Liberation Sans"/>
       <w:sz w:val="28"/>
       <w:szCs w:val="28"/>
     </w:rPr>
   </w:style>
-  <w:style w:type="paragraph" w:styleId="BodyText">
+  <w:style w:type="paragraph" w:styleId="Corpotesto">
     <w:name w:val="Body Text"/>
-    <w:basedOn w:val="Normal"/>
+    <w:basedOn w:val="Normale"/>
     <w:pPr>
-      <w:spacing w:lineRule="auto" w:line="276" w:before="0" w:after="140"/>
+      <w:spacing w:after="140" w:line="276" w:lineRule="auto"/>
     </w:pPr>
-    <w:rPr/>
-  </w:style>
-  <w:style w:type="paragraph" w:styleId="List">
+  </w:style>
+  <w:style w:type="paragraph" w:styleId="Elenco">
     <w:name w:val="List"/>
-    <w:basedOn w:val="BodyText"/>
-    <w:pPr/>
-    <w:rPr>
-      <w:rFonts w:cs="Noto Sans"/>
-    </w:rPr>
-  </w:style>
-  <w:style w:type="paragraph" w:styleId="Caption">
+    <w:basedOn w:val="Corpotesto"/>
+  </w:style>
+  <w:style w:type="paragraph" w:styleId="Didascalia">
     <w:name w:val="caption"/>
-    <w:basedOn w:val="Normal"/>
+    <w:basedOn w:val="Normale"/>
     <w:qFormat/>
     <w:pPr>
       <w:suppressLineNumbers/>
       <w:spacing w:before="120" w:after="120"/>
     </w:pPr>
     <w:rPr>
-      <w:rFonts w:cs="Noto Sans"/>
       <w:i/>
       <w:iCs/>
-      <w:sz w:val="24"/>
-      <w:szCs w:val="24"/>
     </w:rPr>
   </w:style>
-  <w:style w:type="paragraph" w:styleId="Index">
+  <w:style w:type="paragraph" w:customStyle="1" w:styleId="Index">
     <w:name w:val="Index"/>
-    <w:basedOn w:val="Normal"/>
+    <w:basedOn w:val="Normale"/>
     <w:qFormat/>
     <w:pPr>
       <w:suppressLineNumbers/>
     </w:pPr>
+  </w:style>
+  <w:style w:type="character" w:styleId="Menzionenonrisolta">
+    <w:name w:val="Unresolved Mention"/>
+    <w:basedOn w:val="Carpredefinitoparagrafo"/>
+    <w:uiPriority w:val="99"/>
+    <w:semiHidden/>
+    <w:unhideWhenUsed/>
+    <w:rsid w:val="00D1578D"/>
     <w:rPr>
-      <w:rFonts w:cs="Noto Sans"/>
+      <w:color w:val="605E5C"/>
+      <w:shd w:val="clear" w:color="auto" w:fill="E1DFDD"/>
     </w:rPr>
   </w:style>
 </w:styles>
 </file>
 
 <file path=word/theme/theme1.xml><?xml version="1.0" encoding="utf-8"?>
-<a:theme xmlns:a="http://schemas.openxmlformats.org/drawingml/2006/main" xmlns:r="http://schemas.openxmlformats.org/officeDocument/2006/relationships" name="Office">
+<a:theme xmlns:a="http://schemas.openxmlformats.org/drawingml/2006/main" name="Office">
   <a:themeElements>
     <a:clrScheme name="LibreOffice">
       <a:dk1>
@@ -730,14 +1190,14 @@
     </a:clrScheme>
     <a:fontScheme name="Office">
       <a:majorFont>
-        <a:latin typeface="Arial" pitchFamily="0" charset="1"/>
-        <a:ea typeface="DejaVu Sans" pitchFamily="0" charset="1"/>
-        <a:cs typeface="DejaVu Sans" pitchFamily="0" charset="1"/>
+        <a:latin typeface="Arial"/>
+        <a:ea typeface="DejaVu Sans"/>
+        <a:cs typeface="DejaVu Sans"/>
       </a:majorFont>
       <a:minorFont>
-        <a:latin typeface="Arial" pitchFamily="0" charset="1"/>
-        <a:ea typeface="DejaVu Sans" pitchFamily="0" charset="1"/>
-        <a:cs typeface="DejaVu Sans" pitchFamily="0" charset="1"/>
+        <a:latin typeface="Arial"/>
+        <a:ea typeface="DejaVu Sans"/>
+        <a:cs typeface="DejaVu Sans"/>
       </a:minorFont>
     </a:fontScheme>
     <a:fmtScheme>
@@ -790,5 +1250,7 @@
       </a:bgFillStyleLst>
     </a:fmtScheme>
   </a:themeElements>
+  <a:objectDefaults/>
+  <a:extraClrSchemeLst/>
 </a:theme>
 </file>
</xml_diff>